<commit_message>
Structure lab 3 Test IT plan and name checklist checks; sync updated assignments
</commit_message>
<xml_diff>
--- a/Готовые работы/Лабораторная 3 — Командный отчёт.docx
+++ b/Готовые работы/Лабораторная 3 — Командный отчёт.docx
@@ -149,7 +149,7 @@
     </w:p>
     <w:p>
       <w:r>
-        <w:t>Окружение проверок: Windows 11, Chromium 139.0.7258.5, Playwright 1.51.1, 1366 × 900 CSS px, en-US, масштаб 100%. Сайт проверен 25.09.2026; версия сборки неизвестна. Действия в браузере автоматизированы, затем результаты записаны в ручные сущности Test IT через API и проверены в интерфейсе. На снимках Test IT окно 1600 × 1200 CSS px. Это общий прогон команды, а не четыре независимых сеанса.</w:t>
+        <w:t>Окружение проверок: Windows 11 Pro, версия 10.0.22631, сборка 22631; настольный компьютер; Chromium 139.0.7258.5, headless; Playwright 1.51.1; размер видимой области браузера 1366 × 900 CSS px; масштаб 100%, коэффициент пикселей 1; язык en-US; часовой пояс Europe/Moscow. Сайт проверен 25.09.2026; номер сборки неизвестен. Действия автоматизированы, результаты записаны в ручные сущности Test IT через API. На снимках Test IT видимая область браузера 1600 × 1200 CSS px. Общий прогон команды. Оформление уточнено 09.10.2026.</w:t>
       </w:r>
     </w:p>
     <w:p>
@@ -196,6 +196,11 @@
       </w:pPr>
       <w:r>
         <w:t>2 Краткий тест-план</w:t>
+      </w:r>
+    </w:p>
+    <w:p>
+      <w:r>
+        <w:t>В Test IT разделы плана оформлены отдельными атрибутами: цель, объём, исключения, подход, окружение, команда, критерии входа/выхода, риски и оценка длительности. Продукт, сборка, дата начала и дата окончания заполнены в стандартных полях. Описание содержит краткую аннотацию. Фактические результаты прогона от 25.09.2026 сохранены.</w:t>
       </w:r>
     </w:p>
     <w:tbl>
@@ -401,7 +406,7 @@
                 <w:b w:val="0"/>
                 <w:sz w:val="22"/>
               </w:rPr>
-              <w:t>15 пунктов чек-листа; позитивный, негативный и граничный тест-кейсы. Три кейса детализируют CL-01, CL-13 и CL-05, а не добавляют новые независимые проверки.</w:t>
+              <w:t>15 пунктов чек-листа; позитивный, негативный и граничный тест-кейсы. Три кейса детализируют «10% от 200», «Нечисловой процент» и «Нулевая доля», а не добавляют новые независимые проверки.</w:t>
             </w:r>
           </w:p>
         </w:tc>
@@ -597,6 +602,69 @@
                 <w:sz w:val="22"/>
               </w:rPr>
               <w:t>Четыре участника команды; Chromium, Playwright, Test IT Базовый. В TMS использована одна учётная запись Даниил; исполнители не выдаются за четыре заведённых аккаунта.</w:t>
+            </w:r>
+          </w:p>
+        </w:tc>
+      </w:tr>
+      <w:tr>
+        <w:trPr>
+          <w:cantSplit/>
+        </w:trPr>
+        <w:tc>
+          <w:tcPr>
+            <w:tcW w:type="dxa" w:w="1871"/>
+            <w:tcBorders>
+              <w:top w:val="single" w:sz="4" w:color="D9D9D9"/>
+              <w:left w:val="single" w:sz="4" w:color="D9D9D9"/>
+              <w:bottom w:val="single" w:sz="4" w:color="D9D9D9"/>
+              <w:right w:val="single" w:sz="4" w:color="D9D9D9"/>
+            </w:tcBorders>
+            <w:tcMar>
+              <w:top w:w="90" w:type="dxa"/>
+              <w:left w:w="90" w:type="dxa"/>
+              <w:bottom w:w="90" w:type="dxa"/>
+              <w:right w:w="90" w:type="dxa"/>
+            </w:tcMar>
+            <w:vAlign w:val="center"/>
+          </w:tcPr>
+          <w:p>
+            <w:pPr>
+              <w:spacing w:after="20" w:before="20" w:line="252" w:lineRule="auto"/>
+            </w:pPr>
+            <w:r>
+              <w:rPr>
+                <w:sz w:val="22"/>
+              </w:rPr>
+              <w:t>Окружение</w:t>
+            </w:r>
+          </w:p>
+        </w:tc>
+        <w:tc>
+          <w:tcPr>
+            <w:tcW w:type="dxa" w:w="7767"/>
+            <w:tcBorders>
+              <w:top w:val="single" w:sz="4" w:color="D9D9D9"/>
+              <w:left w:val="single" w:sz="4" w:color="D9D9D9"/>
+              <w:bottom w:val="single" w:sz="4" w:color="D9D9D9"/>
+              <w:right w:val="single" w:sz="4" w:color="D9D9D9"/>
+            </w:tcBorders>
+            <w:tcMar>
+              <w:top w:w="90" w:type="dxa"/>
+              <w:left w:w="90" w:type="dxa"/>
+              <w:bottom w:w="90" w:type="dxa"/>
+              <w:right w:w="90" w:type="dxa"/>
+            </w:tcMar>
+            <w:vAlign w:val="center"/>
+          </w:tcPr>
+          <w:p>
+            <w:pPr>
+              <w:spacing w:after="20" w:before="20" w:line="252" w:lineRule="auto"/>
+            </w:pPr>
+            <w:r>
+              <w:rPr>
+                <w:sz w:val="22"/>
+              </w:rPr>
+              <w:t>Windows 11 Pro, версия 10.0.22631, сборка 22631; настольный компьютер; Chromium 139.0.7258.5, headless; Playwright 1.51.1; размер видимой области браузера 1366 × 900 CSS px; масштаб 100%, коэффициент пикселей 1; язык en-US; часовой пояс Europe/Moscow.</w:t>
             </w:r>
           </w:p>
         </w:tc>
@@ -940,12 +1008,116 @@
         <w:pStyle w:val="Heading1"/>
       </w:pPr>
       <w:r>
-        <w:t>3 Чек-лист: CL-01–CL-08</w:t>
+        <w:t>Структура тест-плана в Test IT</w:t>
       </w:r>
     </w:p>
     <w:p>
       <w:r>
-        <w:t>ID чек-листа в библиотеке — 3. В таблицах значения перечислены слева направо: процент; база; результат. Знак «пусто» означает пустую строку. Статусы отражают выполненную проверку. Нулевая доля рассматривается как особое граничное значение, а не как нижний предел всех допустимых процентов.</w:t>
+        <w:t>Два последовательных фрагмента панели атрибутов: стандартные поля и начало разделов слева, продолжение разделов справа. Полные значения приведены в таблице плана и plan-structure.json.</w:t>
+      </w:r>
+    </w:p>
+    <w:p>
+      <w:pPr>
+        <w:keepNext/>
+        <w:keepLines/>
+        <w:jc w:val="center"/>
+      </w:pPr>
+      <w:r>
+        <w:drawing>
+          <wp:inline xmlns:a="http://schemas.openxmlformats.org/drawingml/2006/main" xmlns:pic="http://schemas.openxmlformats.org/drawingml/2006/picture">
+            <wp:extent cx="2448000" cy="4488000"/>
+            <wp:docPr id="7" name="Picture 7"/>
+            <wp:cNvGraphicFramePr>
+              <a:graphicFrameLocks noChangeAspect="1"/>
+            </wp:cNvGraphicFramePr>
+            <a:graphic>
+              <a:graphicData uri="http://schemas.openxmlformats.org/drawingml/2006/picture">
+                <pic:pic>
+                  <pic:nvPicPr>
+                    <pic:cNvPr id="0" name="plan-fields.png"/>
+                    <pic:cNvPicPr/>
+                  </pic:nvPicPr>
+                  <pic:blipFill>
+                    <a:blip r:embed="rId17"/>
+                    <a:stretch>
+                      <a:fillRect/>
+                    </a:stretch>
+                  </pic:blipFill>
+                  <pic:spPr>
+                    <a:xfrm>
+                      <a:off x="0" y="0"/>
+                      <a:ext cx="2808000" cy="5148000"/>
+                    </a:xfrm>
+                    <a:prstGeom prst="rect"/>
+                  </pic:spPr>
+                </pic:pic>
+              </a:graphicData>
+            </a:graphic>
+          </wp:inline>
+        </w:drawing>
+      </w:r>
+      <w:r>
+        <w:t xml:space="preserve">  </w:t>
+      </w:r>
+      <w:r>
+        <w:drawing>
+          <wp:inline xmlns:a="http://schemas.openxmlformats.org/drawingml/2006/main" xmlns:pic="http://schemas.openxmlformats.org/drawingml/2006/picture">
+            <wp:extent cx="2448000" cy="4488000"/>
+            <wp:docPr id="8" name="Picture 8"/>
+            <wp:cNvGraphicFramePr>
+              <a:graphicFrameLocks noChangeAspect="1"/>
+            </wp:cNvGraphicFramePr>
+            <a:graphic>
+              <a:graphicData uri="http://schemas.openxmlformats.org/drawingml/2006/picture">
+                <pic:pic>
+                  <pic:nvPicPr>
+                    <pic:cNvPr id="0" name="plan-details.png"/>
+                    <pic:cNvPicPr/>
+                  </pic:nvPicPr>
+                  <pic:blipFill>
+                    <a:blip r:embed="rId18"/>
+                    <a:stretch>
+                      <a:fillRect/>
+                    </a:stretch>
+                  </pic:blipFill>
+                  <pic:spPr>
+                    <a:xfrm>
+                      <a:off x="0" y="0"/>
+                      <a:ext cx="2808000" cy="5148000"/>
+                    </a:xfrm>
+                    <a:prstGeom prst="rect"/>
+                  </pic:spPr>
+                </pic:pic>
+              </a:graphicData>
+            </a:graphic>
+          </wp:inline>
+        </w:drawing>
+      </w:r>
+    </w:p>
+    <w:p>
+      <w:pPr>
+        <w:pStyle w:val="Caption"/>
+      </w:pPr>
+      <w:r>
+        <w:t>Отдельные атрибуты плана в интерфейсе Test IT после уточнения оформления</w:t>
+      </w:r>
+    </w:p>
+    <w:p>
+      <w:r>
+        <w:br w:type="page"/>
+      </w:r>
+    </w:p>
+    <w:p>
+      <w:pPr>
+        <w:pStyle w:val="Heading1"/>
+      </w:pPr>
+      <w:r>
+        <w:t>3 Чек-лист расчёта процентов Основные и числовые проверки</w:t>
+      </w:r>
+    </w:p>
+    <w:p>
+      <w:r>
+        <w:t>Название в библиотеке — «ЛР3 Чек-лист расчёта процентов — 15 проверок». В таблицах значения перечислены слева направо: процент; база; результат. Знак «пусто» означает пустую строку. Статусы отражают выполненную проверку. Нулевая доля рассматривается как особое граничное значение, а не как нижний предел всех допустимых процентов.</w:t>
       </w:r>
     </w:p>
     <w:tbl>
@@ -1120,8 +1292,6 @@
                 <w:b w:val="0"/>
                 <w:sz w:val="22"/>
               </w:rPr>
-              <w:t>CL-01</w:t>
-              <w:br/>
               <w:t>10% от 200</w:t>
             </w:r>
           </w:p>
@@ -1249,8 +1419,6 @@
                 <w:b w:val="0"/>
                 <w:sz w:val="22"/>
               </w:rPr>
-              <w:t>CL-02</w:t>
-              <w:br/>
               <w:t>25% от 80</w:t>
             </w:r>
           </w:p>
@@ -1378,8 +1546,6 @@
                 <w:b w:val="0"/>
                 <w:sz w:val="22"/>
               </w:rPr>
-              <w:t>CL-03</w:t>
-              <w:br/>
               <w:t>Доля 20 от 200</w:t>
             </w:r>
           </w:p>
@@ -1432,15 +1598,8 @@
             <w:vAlign w:val="center"/>
           </w:tcPr>
           <w:p>
-            <w:pPr>
-              <w:spacing w:after="20" w:before="20" w:line="252" w:lineRule="auto"/>
-            </w:pPr>
             <w:r>
-              <w:rPr>
-                <w:b w:val="0"/>
-                <w:sz w:val="22"/>
-              </w:rPr>
-              <w:t>10</w:t>
+              <w:t>10%</w:t>
             </w:r>
           </w:p>
         </w:tc>
@@ -1507,8 +1666,6 @@
                 <w:b w:val="0"/>
                 <w:sz w:val="22"/>
               </w:rPr>
-              <w:t>CL-04</w:t>
-              <w:br/>
               <w:t>Восстановление базы 10% = 20</w:t>
             </w:r>
           </w:p>
@@ -1636,8 +1793,6 @@
                 <w:b w:val="0"/>
                 <w:sz w:val="22"/>
               </w:rPr>
-              <w:t>CL-05</w:t>
-              <w:br/>
               <w:t>Нулевая доля</w:t>
             </w:r>
           </w:p>
@@ -1765,8 +1920,6 @@
                 <w:b w:val="0"/>
                 <w:sz w:val="22"/>
               </w:rPr>
-              <w:t>CL-06</w:t>
-              <w:br/>
               <w:t>Все число 100%</w:t>
             </w:r>
           </w:p>
@@ -1894,8 +2047,6 @@
                 <w:b w:val="0"/>
                 <w:sz w:val="22"/>
               </w:rPr>
-              <w:t>CL-07</w:t>
-              <w:br/>
               <w:t>Доля больше 100%</w:t>
             </w:r>
           </w:p>
@@ -2023,8 +2174,6 @@
                 <w:b w:val="0"/>
                 <w:sz w:val="22"/>
               </w:rPr>
-              <w:t>CL-08</w:t>
-              <w:br/>
               <w:t>Дробный процент</w:t>
             </w:r>
           </w:p>
@@ -2136,7 +2285,7 @@
         <w:pStyle w:val="Heading1"/>
       </w:pPr>
       <w:r>
-        <w:t>Чек-лист: CL-09–CL-15</w:t>
+        <w:t>Чек-лист расчёта процентов Дроби и обработка ошибок</w:t>
       </w:r>
     </w:p>
     <w:tbl>
@@ -2311,8 +2460,6 @@
                 <w:b w:val="0"/>
                 <w:sz w:val="22"/>
               </w:rPr>
-              <w:t>CL-09</w:t>
-              <w:br/>
               <w:t>Дробное число</w:t>
             </w:r>
           </w:p>
@@ -2440,8 +2587,6 @@
                 <w:b w:val="0"/>
                 <w:sz w:val="22"/>
               </w:rPr>
-              <w:t>CL-10</w:t>
-              <w:br/>
               <w:t>Отрицательная база</w:t>
             </w:r>
           </w:p>
@@ -2569,8 +2714,6 @@
                 <w:b w:val="0"/>
                 <w:sz w:val="22"/>
               </w:rPr>
-              <w:t>CL-11</w:t>
-              <w:br/>
               <w:t>Все поля пусты</w:t>
             </w:r>
           </w:p>
@@ -2698,8 +2841,6 @@
                 <w:b w:val="0"/>
                 <w:sz w:val="22"/>
               </w:rPr>
-              <w:t>CL-12</w:t>
-              <w:br/>
               <w:t>Заполнено только одно поле</w:t>
             </w:r>
           </w:p>
@@ -2827,8 +2968,6 @@
                 <w:b w:val="0"/>
                 <w:sz w:val="22"/>
               </w:rPr>
-              <w:t>CL-13</w:t>
-              <w:br/>
               <w:t>Нечисловой процент</w:t>
             </w:r>
           </w:p>
@@ -2948,16 +3087,7 @@
             <w:vAlign w:val="center"/>
           </w:tcPr>
           <w:p>
-            <w:pPr>
-              <w:spacing w:after="20" w:before="20" w:line="252" w:lineRule="auto"/>
-            </w:pPr>
             <w:r>
-              <w:rPr>
-                <w:b w:val="0"/>
-                <w:sz w:val="22"/>
-              </w:rPr>
-              <w:t>CL-14</w:t>
-              <w:br/>
               <w:t>Противоречивые три значения</w:t>
             </w:r>
           </w:p>
@@ -3085,8 +3215,6 @@
                 <w:b w:val="0"/>
                 <w:sz w:val="22"/>
               </w:rPr>
-              <w:t>CL-15</w:t>
-              <w:br/>
               <w:t>Нулевая база</w:t>
             </w:r>
           </w:p>
@@ -3190,7 +3318,7 @@
     </w:p>
     <w:p>
       <w:r>
-        <w:t>CL-14: подсказка формы предлагает ввести два значения. Ожидалось отклонение противоречивого заполнения 10; 200; 999 либо явное согласование полей. Получен результат 20 при сохранении 999 в третьем поле. Арифметика верна; дефект состоит в противоречии формы и результата. Чек-лист в целом отмечен «Провален».</w:t>
+        <w:t>Проверка «Противоречивые три значения»: подсказка формы предлагает ввести два значения. Ожидалось отклонение противоречивого заполнения 10; 200; 999 либо явное согласование полей. Получен результат 20 при сохранении 999 в третьем поле. Арифметика верна; дефект состоит в противоречии формы и результата. Чек-лист в целом отмечен «Провален».</w:t>
       </w:r>
     </w:p>
     <w:p>
@@ -3204,6 +3332,11 @@
       </w:pPr>
       <w:r>
         <w:t>Чек-лист и статусы в Test IT</w:t>
+      </w:r>
+    </w:p>
+    <w:p>
+      <w:r>
+        <w:t>Снимок результатов ниже относится к выполнению от 25.09.2026. Актуальные пункты в библиотеке именуются по содержанию без префиксов CL; имена приведены в таблицах и на следующем снимке.</w:t>
       </w:r>
     </w:p>
     <w:p>
@@ -3266,7 +3399,67 @@
         <w:pStyle w:val="Heading1"/>
       </w:pPr>
       <w:r>
-        <w:t>4.1 Тест-кейс 4. Позитивный</w:t>
+        <w:t>Актуальные названия пунктов чек-листа</w:t>
+      </w:r>
+    </w:p>
+    <w:p>
+      <w:pPr>
+        <w:jc w:val="center"/>
+      </w:pPr>
+      <w:r>
+        <w:drawing>
+          <wp:inline xmlns:a="http://schemas.openxmlformats.org/drawingml/2006/main" xmlns:pic="http://schemas.openxmlformats.org/drawingml/2006/picture">
+            <wp:extent cx="5940000" cy="5043396"/>
+            <wp:docPr id="9" name="Picture 9"/>
+            <wp:cNvGraphicFramePr>
+              <a:graphicFrameLocks noChangeAspect="1"/>
+            </wp:cNvGraphicFramePr>
+            <a:graphic>
+              <a:graphicData uri="http://schemas.openxmlformats.org/drawingml/2006/picture">
+                <pic:pic>
+                  <pic:nvPicPr>
+                    <pic:cNvPr id="0" name="image.png"/>
+                    <pic:cNvPicPr/>
+                  </pic:nvPicPr>
+                  <pic:blipFill>
+                    <a:blip r:embed="rId16"/>
+                    <a:stretch>
+                      <a:fillRect/>
+                    </a:stretch>
+                  </pic:blipFill>
+                  <pic:spPr>
+                    <a:xfrm>
+                      <a:off x="0" y="0"/>
+                      <a:ext cx="5940000" cy="5043396"/>
+                    </a:xfrm>
+                    <a:prstGeom prst="rect"/>
+                  </pic:spPr>
+                </pic:pic>
+              </a:graphicData>
+            </a:graphic>
+          </wp:inline>
+        </w:drawing>
+      </w:r>
+    </w:p>
+    <w:p>
+      <w:pPr>
+        <w:pStyle w:val="Caption"/>
+      </w:pPr>
+      <w:r>
+        <w:t>Названия 15 проверок в библиотеке Test IT после уточнения оформления</w:t>
+      </w:r>
+    </w:p>
+    <w:p>
+      <w:r>
+        <w:br w:type="page"/>
+      </w:r>
+    </w:p>
+    <w:p>
+      <w:pPr>
+        <w:pStyle w:val="Heading1"/>
+      </w:pPr>
+      <w:r>
+        <w:t>4.1 Тест-кейс Позитивный расчёт процентов</w:t>
       </w:r>
     </w:p>
     <w:p>
@@ -3985,7 +4178,7 @@
         <w:pStyle w:val="Heading1"/>
       </w:pPr>
       <w:r>
-        <w:t>4.2 Тест-кейс 5. Негативный</w:t>
+        <w:t>4.2 Тест-кейс Нечисловой ввод</w:t>
       </w:r>
     </w:p>
     <w:p>
@@ -4704,7 +4897,7 @@
         <w:pStyle w:val="Heading1"/>
       </w:pPr>
       <w:r>
-        <w:t>4.3 Тест-кейс 6. Граничный</w:t>
+        <w:t>4.3 Тест-кейс Нулевой процент</w:t>
       </w:r>
     </w:p>
     <w:p>
@@ -5428,7 +5621,7 @@
     </w:p>
     <w:p>
       <w:r>
-        <w:t>В пользовательском наборе четыре сущности: чек-лист ID 3 — Failed; позитивный ID 4, негативный ID 5 и граничный ID 6 — Passed. План завершён, выполнено 100% тест-поинтов. Доля успешных сущностей 75%; это не доля успешных пунктов чек-листа, где 14/15 ≈ 93.3%.</w:t>
+        <w:t>В пользовательском наборе четыре сущности: «ЛР3 Чек-лист расчёта процентов — 15 проверок» — Failed; «ЛР3 Позитивный — 10% от 200», «ЛР3 Негативный — Нечисловой процент» и «ЛР3 Граничный — Нулевая доля» — Passed. План завершён, выполнено 100% тест-поинтов. Доля успешных сущностей 75%; это не доля успешных пунктов чек-листа, где 14/15 ≈ 93.3%.</w:t>
       </w:r>
     </w:p>
     <w:p>
@@ -5506,7 +5699,7 @@
     </w:p>
     <w:p>
       <w:r>
-        <w:t>Основной урок — не смешивать завершение проверки с отсутствием дефектов. Все проверки выполнены, но CL-14 провален; этот факт сохранён в TMS и не заменён успешным статусом. Для негативного кейса корректный отказ системы является успешным результатом теста. Полученные статусы относятся к текущему набору, а не доказывают качество всего сервиса.</w:t>
+        <w:t>Основной урок — не смешивать завершение проверки с отсутствием дефектов. Все проверки выполнены, но Проверка «Противоречивые три значения» провалена; этот факт сохранён в TMS и не заменён успешным статусом. Для негативного кейса корректный отказ системы является успешным результатом теста. Полученные статусы относятся к текущему набору, а не доказывают качество всего сервиса.</w:t>
       </w:r>
     </w:p>
     <w:p>

</xml_diff>